<commit_message>
style: refine Maya reader layout
</commit_message>
<xml_diff>
--- a/source-books/book-3-maya-tradition/outputs/Maya_Aztec_Egregor_Gods.docx
+++ b/source-books/book-3-maya-tradition/outputs/Maya_Aztec_Egregor_Gods.docx
@@ -49,7 +49,7 @@
     </w:p>
     <w:p>
       <w:pPr>
-        <w:jc w:val="center"/>
+        <w:jc w:val="right"/>
       </w:pPr>
       <w:r>
         <w:drawing>
@@ -126,14 +126,14 @@
     </w:p>
     <w:p>
       <w:pPr>
-        <w:spacing w:before="0" w:after="280" w:line="336" w:lineRule="auto"/>
+        <w:spacing w:before="0" w:after="280" w:line="300" w:lineRule="auto"/>
       </w:pPr>
       <w:r>
         <w:rPr>
           <w:rFonts w:ascii="Georgia" w:hAnsi="Georgia"/>
           <w:b w:val="0"/>
           <w:color w:val="2F241D"/>
-          <w:sz w:val="29"/>
+          <w:sz w:val="30"/>
         </w:rPr>
         <w:t>Это паблик является продолжением наших Курсов по изучению Традиции Шаманизма Мезоамерики.</w:t>
         <w:br/>
@@ -547,7 +547,7 @@
     <w:p>
       <w:bookmarkStart w:id="1" w:name="chapter_1"/>
       <w:pPr>
-        <w:spacing w:before="240" w:after="200" w:line="336" w:lineRule="auto"/>
+        <w:spacing w:before="240" w:after="200" w:line="300" w:lineRule="auto"/>
       </w:pPr>
       <w:r>
         <w:rPr>
@@ -602,6 +602,7 @@
     <w:tbl>
       <w:tblPr>
         <w:tblW w:type="auto" w:w="0"/>
+        <w:jc w:val="right"/>
         <w:tblLayout w:type="fixed"/>
         <w:tblLook w:firstColumn="1" w:firstRow="1" w:lastColumn="0" w:lastRow="0" w:noHBand="0" w:noVBand="1" w:val="04A0"/>
       </w:tblPr>
@@ -757,14 +758,14 @@
     </w:tbl>
     <w:p>
       <w:pPr>
-        <w:spacing w:before="240" w:after="140" w:line="336" w:lineRule="auto"/>
+        <w:spacing w:before="240" w:after="140" w:line="300" w:lineRule="auto"/>
       </w:pPr>
       <w:r>
         <w:rPr>
           <w:rFonts w:ascii="Georgia" w:hAnsi="Georgia"/>
           <w:b w:val="0"/>
           <w:color w:val="2F241D"/>
-          <w:sz w:val="29"/>
+          <w:sz w:val="30"/>
         </w:rPr>
         <w:t>ЭГРЕГОР МАЙЯ.</w:t>
         <w:br/>
@@ -866,6 +867,7 @@
     <w:tbl>
       <w:tblPr>
         <w:tblW w:type="auto" w:w="0"/>
+        <w:jc w:val="right"/>
         <w:tblLayout w:type="fixed"/>
         <w:tblLook w:firstColumn="1" w:firstRow="1" w:lastColumn="0" w:lastRow="0" w:noHBand="0" w:noVBand="1" w:val="04A0"/>
       </w:tblPr>
@@ -991,14 +993,14 @@
     </w:tbl>
     <w:p>
       <w:pPr>
-        <w:spacing w:before="240" w:after="140" w:line="336" w:lineRule="auto"/>
+        <w:spacing w:before="240" w:after="140" w:line="300" w:lineRule="auto"/>
       </w:pPr>
       <w:r>
         <w:rPr>
           <w:rFonts w:ascii="Georgia" w:hAnsi="Georgia"/>
           <w:b w:val="0"/>
           <w:color w:val="2F241D"/>
-          <w:sz w:val="29"/>
+          <w:sz w:val="30"/>
         </w:rPr>
         <w:t>Эгрегор майянских богов дает ощущение веления вечности и жизни в мгновении. Защита майянской традиции включает ощущение полноты жизни. Она зажигает свет внутри, который прорывает любые преграды ночи.</w:t>
         <w:br/>
@@ -1055,6 +1057,7 @@
     <w:tbl>
       <w:tblPr>
         <w:tblW w:type="auto" w:w="0"/>
+        <w:jc w:val="right"/>
         <w:tblLayout w:type="fixed"/>
         <w:tblLook w:firstColumn="1" w:firstRow="1" w:lastColumn="0" w:lastRow="0" w:noHBand="0" w:noVBand="1" w:val="04A0"/>
       </w:tblPr>
@@ -1180,14 +1183,14 @@
     </w:tbl>
     <w:p>
       <w:pPr>
-        <w:spacing w:before="240" w:after="140" w:line="336" w:lineRule="auto"/>
+        <w:spacing w:before="240" w:after="140" w:line="300" w:lineRule="auto"/>
       </w:pPr>
       <w:r>
         <w:rPr>
           <w:rFonts w:ascii="Georgia" w:hAnsi="Georgia"/>
           <w:b w:val="0"/>
           <w:color w:val="2F241D"/>
-          <w:sz w:val="29"/>
+          <w:sz w:val="30"/>
         </w:rPr>
         <w:t>Давайте попробуем прислушаться к Голосу Майя.</w:t>
         <w:br/>
@@ -1291,6 +1294,7 @@
     <w:tbl>
       <w:tblPr>
         <w:tblW w:type="auto" w:w="0"/>
+        <w:jc w:val="right"/>
         <w:tblLayout w:type="fixed"/>
         <w:tblLook w:firstColumn="1" w:firstRow="1" w:lastColumn="0" w:lastRow="0" w:noHBand="0" w:noVBand="1" w:val="04A0"/>
       </w:tblPr>
@@ -1446,14 +1450,14 @@
     </w:tbl>
     <w:p>
       <w:pPr>
-        <w:spacing w:before="240" w:after="140" w:line="336" w:lineRule="auto"/>
+        <w:spacing w:before="240" w:after="140" w:line="300" w:lineRule="auto"/>
       </w:pPr>
       <w:r>
         <w:rPr>
           <w:rFonts w:ascii="Georgia" w:hAnsi="Georgia"/>
           <w:b w:val="0"/>
           <w:color w:val="2F241D"/>
-          <w:sz w:val="29"/>
+          <w:sz w:val="30"/>
         </w:rPr>
         <w:t>Пять кодексов эгрегора Майя/ Каналы Богов. (Мое восприятие ценностей-установок эгрегора).</w:t>
         <w:br/>
@@ -1553,6 +1557,7 @@
     <w:tbl>
       <w:tblPr>
         <w:tblW w:type="auto" w:w="0"/>
+        <w:jc w:val="right"/>
         <w:tblLayout w:type="fixed"/>
         <w:tblLook w:firstColumn="1" w:firstRow="1" w:lastColumn="0" w:lastRow="0" w:noHBand="0" w:noVBand="1" w:val="04A0"/>
       </w:tblPr>
@@ -1708,14 +1713,14 @@
     </w:tbl>
     <w:p>
       <w:pPr>
-        <w:spacing w:before="240" w:after="140" w:line="336" w:lineRule="auto"/>
+        <w:spacing w:before="240" w:after="140" w:line="300" w:lineRule="auto"/>
       </w:pPr>
       <w:r>
         <w:rPr>
           <w:rFonts w:ascii="Georgia" w:hAnsi="Georgia"/>
           <w:b w:val="0"/>
           <w:color w:val="2F241D"/>
-          <w:sz w:val="29"/>
+          <w:sz w:val="30"/>
         </w:rPr>
         <w:t>Концепция жизни, крови и первоматерии в Традиции Майя.</w:t>
         <w:br/>
@@ -1795,6 +1800,7 @@
     <w:tbl>
       <w:tblPr>
         <w:tblW w:type="auto" w:w="0"/>
+        <w:jc w:val="right"/>
         <w:tblLayout w:type="fixed"/>
         <w:tblLook w:firstColumn="1" w:firstRow="1" w:lastColumn="0" w:lastRow="0" w:noHBand="0" w:noVBand="1" w:val="04A0"/>
       </w:tblPr>
@@ -1950,14 +1956,14 @@
     </w:tbl>
     <w:p>
       <w:pPr>
-        <w:spacing w:before="240" w:after="140" w:line="336" w:lineRule="auto"/>
+        <w:spacing w:before="240" w:after="140" w:line="300" w:lineRule="auto"/>
       </w:pPr>
       <w:r>
         <w:rPr>
           <w:rFonts w:ascii="Georgia" w:hAnsi="Georgia"/>
           <w:b w:val="0"/>
           <w:color w:val="2F241D"/>
-          <w:sz w:val="29"/>
+          <w:sz w:val="30"/>
         </w:rPr>
         <w:t>Часть 2. Как накопить силу?</w:t>
         <w:br/>
@@ -1998,7 +2004,7 @@
     <w:p>
       <w:bookmarkStart w:id="8" w:name="chapter_2"/>
       <w:pPr>
-        <w:spacing w:before="240" w:after="200" w:line="336" w:lineRule="auto"/>
+        <w:spacing w:before="240" w:after="200" w:line="300" w:lineRule="auto"/>
       </w:pPr>
       <w:r>
         <w:rPr>
@@ -2053,6 +2059,7 @@
     <w:tbl>
       <w:tblPr>
         <w:tblW w:type="auto" w:w="0"/>
+        <w:jc w:val="right"/>
         <w:tblLayout w:type="fixed"/>
         <w:tblLook w:firstColumn="1" w:firstRow="1" w:lastColumn="0" w:lastRow="0" w:noHBand="0" w:noVBand="1" w:val="04A0"/>
       </w:tblPr>
@@ -2208,14 +2215,14 @@
     </w:tbl>
     <w:p>
       <w:pPr>
-        <w:spacing w:before="240" w:after="140" w:line="336" w:lineRule="auto"/>
+        <w:spacing w:before="240" w:after="140" w:line="300" w:lineRule="auto"/>
       </w:pPr>
       <w:r>
         <w:rPr>
           <w:rFonts w:ascii="Georgia" w:hAnsi="Georgia"/>
           <w:b w:val="0"/>
           <w:color w:val="2F241D"/>
-          <w:sz w:val="29"/>
+          <w:sz w:val="30"/>
         </w:rPr>
         <w:t>КИНИЧ АХАУ.</w:t>
         <w:br/>
@@ -2311,6 +2318,7 @@
     <w:tbl>
       <w:tblPr>
         <w:tblW w:type="auto" w:w="0"/>
+        <w:jc w:val="right"/>
         <w:tblLayout w:type="fixed"/>
         <w:tblLook w:firstColumn="1" w:firstRow="1" w:lastColumn="0" w:lastRow="0" w:noHBand="0" w:noVBand="1" w:val="04A0"/>
       </w:tblPr>
@@ -2466,14 +2474,14 @@
     </w:tbl>
     <w:p>
       <w:pPr>
-        <w:spacing w:before="240" w:after="140" w:line="336" w:lineRule="auto"/>
+        <w:spacing w:before="240" w:after="140" w:line="300" w:lineRule="auto"/>
       </w:pPr>
       <w:r>
         <w:rPr>
           <w:rFonts w:ascii="Georgia" w:hAnsi="Georgia"/>
           <w:b w:val="0"/>
           <w:color w:val="2F241D"/>
-          <w:sz w:val="29"/>
+          <w:sz w:val="30"/>
         </w:rPr>
         <w:t>СИЛА СОЛНЦА -  КУЛЬТУРА МАЙЯ</w:t>
         <w:br/>
@@ -2555,6 +2563,7 @@
     <w:tbl>
       <w:tblPr>
         <w:tblW w:type="auto" w:w="0"/>
+        <w:jc w:val="right"/>
         <w:tblLayout w:type="fixed"/>
         <w:tblLook w:firstColumn="1" w:firstRow="1" w:lastColumn="0" w:lastRow="0" w:noHBand="0" w:noVBand="1" w:val="04A0"/>
       </w:tblPr>
@@ -2710,14 +2719,14 @@
     </w:tbl>
     <w:p>
       <w:pPr>
-        <w:spacing w:before="240" w:after="140" w:line="336" w:lineRule="auto"/>
+        <w:spacing w:before="240" w:after="140" w:line="300" w:lineRule="auto"/>
       </w:pPr>
       <w:r>
         <w:rPr>
           <w:rFonts w:ascii="Georgia" w:hAnsi="Georgia"/>
           <w:b w:val="0"/>
           <w:color w:val="2F241D"/>
-          <w:sz w:val="29"/>
+          <w:sz w:val="30"/>
         </w:rPr>
         <w:t>2. ЭНЕРГИЯ ИК' (Ветер).</w:t>
         <w:br/>
@@ -2825,6 +2834,7 @@
     <w:tbl>
       <w:tblPr>
         <w:tblW w:type="auto" w:w="0"/>
+        <w:jc w:val="right"/>
         <w:tblLayout w:type="fixed"/>
         <w:tblLook w:firstColumn="1" w:firstRow="1" w:lastColumn="0" w:lastRow="0" w:noHBand="0" w:noVBand="1" w:val="04A0"/>
       </w:tblPr>
@@ -2980,14 +2990,14 @@
     </w:tbl>
     <w:p>
       <w:pPr>
-        <w:spacing w:before="240" w:after="140" w:line="336" w:lineRule="auto"/>
+        <w:spacing w:before="240" w:after="140" w:line="300" w:lineRule="auto"/>
       </w:pPr>
       <w:r>
         <w:rPr>
           <w:rFonts w:ascii="Georgia" w:hAnsi="Georgia"/>
           <w:b w:val="0"/>
           <w:color w:val="2F241D"/>
-          <w:sz w:val="29"/>
+          <w:sz w:val="30"/>
         </w:rPr>
         <w:t>ИшМук'ане.</w:t>
         <w:br/>
@@ -3077,6 +3087,7 @@
     <w:tbl>
       <w:tblPr>
         <w:tblW w:type="auto" w:w="0"/>
+        <w:jc w:val="right"/>
         <w:tblLayout w:type="fixed"/>
         <w:tblLook w:firstColumn="1" w:firstRow="1" w:lastColumn="0" w:lastRow="0" w:noHBand="0" w:noVBand="1" w:val="04A0"/>
       </w:tblPr>
@@ -3202,14 +3213,14 @@
     </w:tbl>
     <w:p>
       <w:pPr>
-        <w:spacing w:before="240" w:after="140" w:line="336" w:lineRule="auto"/>
+        <w:spacing w:before="240" w:after="140" w:line="300" w:lineRule="auto"/>
       </w:pPr>
       <w:r>
         <w:rPr>
           <w:rFonts w:ascii="Georgia" w:hAnsi="Georgia"/>
           <w:b w:val="0"/>
           <w:color w:val="2F241D"/>
-          <w:sz w:val="29"/>
+          <w:sz w:val="30"/>
         </w:rPr>
         <w:t>3. КИНИЧ АХАУ (Бог Солнца майя).</w:t>
         <w:br/>
@@ -3276,6 +3287,7 @@
     <w:tbl>
       <w:tblPr>
         <w:tblW w:type="auto" w:w="0"/>
+        <w:jc w:val="right"/>
         <w:tblLayout w:type="fixed"/>
         <w:tblLook w:firstColumn="1" w:firstRow="1" w:lastColumn="0" w:lastRow="0" w:noHBand="0" w:noVBand="1" w:val="04A0"/>
       </w:tblPr>
@@ -3401,14 +3413,14 @@
     </w:tbl>
     <w:p>
       <w:pPr>
-        <w:spacing w:before="240" w:after="140" w:line="336" w:lineRule="auto"/>
+        <w:spacing w:before="240" w:after="140" w:line="300" w:lineRule="auto"/>
       </w:pPr>
       <w:r>
         <w:rPr>
           <w:rFonts w:ascii="Georgia" w:hAnsi="Georgia"/>
           <w:b w:val="0"/>
           <w:color w:val="2F241D"/>
-          <w:sz w:val="29"/>
+          <w:sz w:val="30"/>
         </w:rPr>
         <w:t>1. Кинич Ахау (Бог Солнца Майя)</w:t>
         <w:br/>
@@ -3464,6 +3476,7 @@
     <w:tbl>
       <w:tblPr>
         <w:tblW w:type="auto" w:w="0"/>
+        <w:jc w:val="right"/>
         <w:tblLayout w:type="fixed"/>
         <w:tblLook w:firstColumn="1" w:firstRow="1" w:lastColumn="0" w:lastRow="0" w:noHBand="0" w:noVBand="1" w:val="04A0"/>
       </w:tblPr>
@@ -3589,14 +3602,14 @@
     </w:tbl>
     <w:p>
       <w:pPr>
-        <w:spacing w:before="240" w:after="140" w:line="336" w:lineRule="auto"/>
+        <w:spacing w:before="240" w:after="140" w:line="300" w:lineRule="auto"/>
       </w:pPr>
       <w:r>
         <w:rPr>
           <w:rFonts w:ascii="Georgia" w:hAnsi="Georgia"/>
           <w:b w:val="0"/>
           <w:color w:val="2F241D"/>
-          <w:sz w:val="29"/>
+          <w:sz w:val="30"/>
         </w:rPr>
         <w:t>Здесь изображенин ягуара.</w:t>
         <w:br/>
@@ -3660,6 +3673,7 @@
     <w:tbl>
       <w:tblPr>
         <w:tblW w:type="auto" w:w="0"/>
+        <w:jc w:val="right"/>
         <w:tblLayout w:type="fixed"/>
         <w:tblLook w:firstColumn="1" w:firstRow="1" w:lastColumn="0" w:lastRow="0" w:noHBand="0" w:noVBand="1" w:val="04A0"/>
       </w:tblPr>
@@ -3785,14 +3799,14 @@
     </w:tbl>
     <w:p>
       <w:pPr>
-        <w:spacing w:before="240" w:after="140" w:line="336" w:lineRule="auto"/>
+        <w:spacing w:before="240" w:after="140" w:line="300" w:lineRule="auto"/>
       </w:pPr>
       <w:r>
         <w:rPr>
           <w:rFonts w:ascii="Georgia" w:hAnsi="Georgia"/>
           <w:b w:val="0"/>
           <w:color w:val="2F241D"/>
-          <w:sz w:val="29"/>
+          <w:sz w:val="30"/>
         </w:rPr>
         <w:t>Здесь изображения Змея.</w:t>
         <w:br/>
@@ -3854,6 +3868,7 @@
     <w:tbl>
       <w:tblPr>
         <w:tblW w:type="auto" w:w="0"/>
+        <w:jc w:val="right"/>
         <w:tblLayout w:type="fixed"/>
         <w:tblLook w:firstColumn="1" w:firstRow="1" w:lastColumn="0" w:lastRow="0" w:noHBand="0" w:noVBand="1" w:val="04A0"/>
       </w:tblPr>
@@ -3979,14 +3994,14 @@
     </w:tbl>
     <w:p>
       <w:pPr>
-        <w:spacing w:before="240" w:after="140" w:line="336" w:lineRule="auto"/>
+        <w:spacing w:before="240" w:after="140" w:line="300" w:lineRule="auto"/>
       </w:pPr>
       <w:r>
         <w:rPr>
           <w:rFonts w:ascii="Georgia" w:hAnsi="Georgia"/>
           <w:b w:val="0"/>
           <w:color w:val="2F241D"/>
-          <w:sz w:val="29"/>
+          <w:sz w:val="30"/>
         </w:rPr>
         <w:t>Quetzalcoatl.</w:t>
         <w:br/>
@@ -4052,6 +4067,7 @@
     <w:tbl>
       <w:tblPr>
         <w:tblW w:type="auto" w:w="0"/>
+        <w:jc w:val="right"/>
         <w:tblLayout w:type="fixed"/>
         <w:tblLook w:firstColumn="1" w:firstRow="1" w:lastColumn="0" w:lastRow="0" w:noHBand="0" w:noVBand="1" w:val="04A0"/>
       </w:tblPr>
@@ -4207,14 +4223,14 @@
     </w:tbl>
     <w:p>
       <w:pPr>
-        <w:spacing w:before="240" w:after="140" w:line="336" w:lineRule="auto"/>
+        <w:spacing w:before="240" w:after="140" w:line="300" w:lineRule="auto"/>
       </w:pPr>
       <w:r>
         <w:rPr>
           <w:rFonts w:ascii="Georgia" w:hAnsi="Georgia"/>
           <w:b w:val="0"/>
           <w:color w:val="2F241D"/>
-          <w:sz w:val="29"/>
+          <w:sz w:val="30"/>
         </w:rPr>
         <w:t>Эхекатль.</w:t>
         <w:br/>
@@ -4311,6 +4327,7 @@
     <w:tbl>
       <w:tblPr>
         <w:tblW w:type="auto" w:w="0"/>
+        <w:jc w:val="right"/>
         <w:tblLayout w:type="fixed"/>
         <w:tblLook w:firstColumn="1" w:firstRow="1" w:lastColumn="0" w:lastRow="0" w:noHBand="0" w:noVBand="1" w:val="04A0"/>
       </w:tblPr>
@@ -4436,14 +4453,14 @@
     </w:tbl>
     <w:p>
       <w:pPr>
-        <w:spacing w:before="240" w:after="140" w:line="336" w:lineRule="auto"/>
+        <w:spacing w:before="240" w:after="140" w:line="300" w:lineRule="auto"/>
       </w:pPr>
       <w:r>
         <w:rPr>
           <w:rFonts w:ascii="Georgia" w:hAnsi="Georgia"/>
           <w:b w:val="0"/>
           <w:color w:val="2F241D"/>
-          <w:sz w:val="29"/>
+          <w:sz w:val="30"/>
         </w:rPr>
         <w:t>НАСТРОЙКА 3.</w:t>
         <w:br/>
@@ -4550,6 +4567,7 @@
     <w:tbl>
       <w:tblPr>
         <w:tblW w:type="auto" w:w="0"/>
+        <w:jc w:val="right"/>
         <w:tblLayout w:type="fixed"/>
         <w:tblLook w:firstColumn="1" w:firstRow="1" w:lastColumn="0" w:lastRow="0" w:noHBand="0" w:noVBand="1" w:val="04A0"/>
       </w:tblPr>
@@ -4675,14 +4693,14 @@
     </w:tbl>
     <w:p>
       <w:pPr>
-        <w:spacing w:before="240" w:after="140" w:line="336" w:lineRule="auto"/>
+        <w:spacing w:before="240" w:after="140" w:line="300" w:lineRule="auto"/>
       </w:pPr>
       <w:r>
         <w:rPr>
           <w:rFonts w:ascii="Georgia" w:hAnsi="Georgia"/>
           <w:b w:val="0"/>
           <w:color w:val="2F241D"/>
-          <w:sz w:val="29"/>
+          <w:sz w:val="30"/>
         </w:rPr>
         <w:t>Бог Жизни Майя.</w:t>
         <w:br/>
@@ -4800,6 +4818,7 @@
     <w:tbl>
       <w:tblPr>
         <w:tblW w:type="auto" w:w="0"/>
+        <w:jc w:val="right"/>
         <w:tblLayout w:type="fixed"/>
         <w:tblLook w:firstColumn="1" w:firstRow="1" w:lastColumn="0" w:lastRow="0" w:noHBand="0" w:noVBand="1" w:val="04A0"/>
       </w:tblPr>
@@ -4925,14 +4944,14 @@
     </w:tbl>
     <w:p>
       <w:pPr>
-        <w:spacing w:before="240" w:after="140" w:line="336" w:lineRule="auto"/>
+        <w:spacing w:before="240" w:after="140" w:line="300" w:lineRule="auto"/>
       </w:pPr>
       <w:r>
         <w:rPr>
           <w:rFonts w:ascii="Georgia" w:hAnsi="Georgia"/>
           <w:b w:val="0"/>
           <w:color w:val="2F241D"/>
-          <w:sz w:val="29"/>
+          <w:sz w:val="30"/>
         </w:rPr>
         <w:t>НАСТРОЙКА 4. ЧААК.</w:t>
         <w:br/>
@@ -5026,6 +5045,7 @@
     <w:tbl>
       <w:tblPr>
         <w:tblW w:type="auto" w:w="0"/>
+        <w:jc w:val="right"/>
         <w:tblLayout w:type="fixed"/>
         <w:tblLook w:firstColumn="1" w:firstRow="1" w:lastColumn="0" w:lastRow="0" w:noHBand="0" w:noVBand="1" w:val="04A0"/>
       </w:tblPr>
@@ -5151,14 +5171,14 @@
     </w:tbl>
     <w:p>
       <w:pPr>
-        <w:spacing w:before="240" w:after="140" w:line="336" w:lineRule="auto"/>
+        <w:spacing w:before="240" w:after="140" w:line="300" w:lineRule="auto"/>
       </w:pPr>
       <w:r>
         <w:rPr>
           <w:rFonts w:ascii="Georgia" w:hAnsi="Georgia"/>
           <w:b w:val="0"/>
           <w:color w:val="2F241D"/>
-          <w:sz w:val="29"/>
+          <w:sz w:val="30"/>
         </w:rPr>
         <w:t>3. ТЛАЛОК.</w:t>
         <w:br/>
@@ -5224,6 +5244,7 @@
     <w:tbl>
       <w:tblPr>
         <w:tblW w:type="auto" w:w="0"/>
+        <w:jc w:val="right"/>
         <w:tblLayout w:type="fixed"/>
         <w:tblLook w:firstColumn="1" w:firstRow="1" w:lastColumn="0" w:lastRow="0" w:noHBand="0" w:noVBand="1" w:val="04A0"/>
       </w:tblPr>
@@ -5379,14 +5400,14 @@
     </w:tbl>
     <w:p>
       <w:pPr>
-        <w:spacing w:before="240" w:after="140" w:line="336" w:lineRule="auto"/>
+        <w:spacing w:before="240" w:after="140" w:line="300" w:lineRule="auto"/>
       </w:pPr>
       <w:r>
         <w:rPr>
           <w:rFonts w:ascii="Georgia" w:hAnsi="Georgia"/>
           <w:b w:val="0"/>
           <w:color w:val="2F241D"/>
-          <w:sz w:val="29"/>
+          <w:sz w:val="30"/>
         </w:rPr>
         <w:t>Тескатліпо́ка (ісп. Tezcatlipoca) —</w:t>
         <w:br/>
@@ -5830,11 +5851,11 @@
     <w:qFormat/>
     <w:rsid w:val="00FC693F"/>
     <w:pPr>
-      <w:spacing w:line="336" w:lineRule="auto"/>
+      <w:spacing w:line="300" w:lineRule="auto"/>
     </w:pPr>
     <w:rPr>
       <w:rFonts w:ascii="Georgia" w:hAnsi="Georgia"/>
-      <w:sz w:val="29"/>
+      <w:sz w:val="30"/>
     </w:rPr>
   </w:style>
   <w:style w:type="paragraph" w:styleId="Header">

</xml_diff>

<commit_message>
fix: rebalance Maya volumes and page flow
</commit_message>
<xml_diff>
--- a/source-books/book-3-maya-tradition/outputs/Maya_Aztec_Egregor_Gods.docx
+++ b/source-books/book-3-maya-tradition/outputs/Maya_Aztec_Egregor_Gods.docx
@@ -180,6 +180,20 @@
           <w:sz w:val="28"/>
         </w:rPr>
         <w:t>II. Боги и божественные силы Майя и Ацтеков</w:t>
+      </w:r>
+    </w:p>
+    <w:p>
+      <w:pPr>
+        <w:spacing w:before="0" w:after="100" w:line="324" w:lineRule="auto"/>
+      </w:pPr>
+      <w:r>
+        <w:rPr>
+          <w:rFonts w:ascii="Georgia" w:hAnsi="Georgia"/>
+          <w:b/>
+          <w:color w:val="6B2F1A"/>
+          <w:sz w:val="28"/>
+        </w:rPr>
+        <w:t>III. Настройки и энергии Майя и Ацтеков</w:t>
       </w:r>
     </w:p>
     <w:p>
@@ -540,9 +554,48 @@
       </w:hyperlink>
     </w:p>
     <w:p>
-      <w:r>
-        <w:br w:type="page"/>
-      </w:r>
+      <w:pPr>
+        <w:spacing w:before="120" w:after="60" w:line="324" w:lineRule="auto"/>
+      </w:pPr>
+      <w:hyperlink w:anchor="chapter_3">
+        <w:r>
+          <w:rPr>
+            <w:color w:val="6B2F1A"/>
+            <w:u w:val="single"/>
+          </w:rPr>
+          <w:t>III. Настройки и энергии Майя и Ацтеков</w:t>
+        </w:r>
+      </w:hyperlink>
+    </w:p>
+    <w:p>
+      <w:pPr>
+        <w:spacing w:before="0" w:after="40" w:line="276" w:lineRule="auto"/>
+        <w:ind w:left="317"/>
+      </w:pPr>
+      <w:hyperlink w:anchor="article_templetherapy_2262">
+        <w:r>
+          <w:rPr>
+            <w:color w:val="6B2F1A"/>
+            <w:u w:val="single"/>
+          </w:rPr>
+          <w:t>#3. ТРАДИЦИЯ МАЙЯ.</w:t>
+        </w:r>
+      </w:hyperlink>
+    </w:p>
+    <w:p>
+      <w:pPr>
+        <w:spacing w:before="0" w:after="40" w:line="276" w:lineRule="auto"/>
+        <w:ind w:left="317"/>
+      </w:pPr>
+      <w:hyperlink w:anchor="article_mayaismagic_214">
+        <w:r>
+          <w:rPr>
+            <w:color w:val="6B2F1A"/>
+            <w:u w:val="single"/>
+          </w:rPr>
+          <w:t>НАСТРОЙКА.</w:t>
+        </w:r>
+      </w:hyperlink>
     </w:p>
     <w:p>
       <w:bookmarkStart w:id="1" w:name="chapter_1"/>
@@ -820,11 +873,6 @@
         <w:t>С Новым Годом!</w:t>
       </w:r>
     </w:p>
-    <w:p>
-      <w:r>
-        <w:br w:type="page"/>
-      </w:r>
-    </w:p>
     <w:tbl>
       <w:tblPr>
         <w:tblW w:type="auto" w:w="0"/>
@@ -1008,11 +1056,6 @@
         <w:t>Желаю всем освоить красоту, мощь и мудрость этих традиций.</w:t>
         <w:br/>
         <w:t>#рейкииггдрасиль #этнопсихология</w:t>
-      </w:r>
-    </w:p>
-    <w:p>
-      <w:r>
-        <w:br w:type="page"/>
       </w:r>
     </w:p>
     <w:tbl>
@@ -1245,11 +1288,6 @@
         <w:t>- Кинич Ахау - светоносные правители - это Мастера, прошедшие полный цикл обучения в энергиях всех дней Календаря Майя и сумевшие их проявить (создать структуру, бизнес, клуб).</w:t>
         <w:br/>
         <w:t>- Ахау Кин - учителя, жрецы - управляют светом - могут проводить инициации, ритуалы в Традиции майя.</w:t>
-      </w:r>
-    </w:p>
-    <w:p>
-      <w:r>
-        <w:br w:type="page"/>
       </w:r>
     </w:p>
     <w:tbl>
@@ -1510,11 +1548,6 @@
         <w:t>Пишите мысли в комментариях!</w:t>
       </w:r>
     </w:p>
-    <w:p>
-      <w:r>
-        <w:br w:type="page"/>
-      </w:r>
-    </w:p>
     <w:tbl>
       <w:tblPr>
         <w:tblW w:type="auto" w:w="0"/>
@@ -1751,11 +1784,6 @@
         <w:t>teotl - это безличная сакральная сила, пребывающая в мире и одушевляющая любые ритуальные предметы и живые существа, в которых она заключена.</w:t>
         <w:br/>
         <w:t>Словом теотль можно называть так же духов, умерших родственников, царей и друг друга. Общение происходило не между людьми, а между их сутью.</w:t>
-      </w:r>
-    </w:p>
-    <w:p>
-      <w:r>
-        <w:br w:type="page"/>
       </w:r>
     </w:p>
     <w:tbl>
@@ -1994,11 +2022,6 @@
         <w:t>Через Рейки Иггдрасиль можно включаться и брать настройку на к’ух, витальную первоэнергию, жизненную силу в традиции майя.</w:t>
         <w:br/>
         <w:t>Продолжение исследования и настройку на к'ух - я предложу в третьей части этой статьи.</w:t>
-      </w:r>
-    </w:p>
-    <w:p>
-      <w:r>
-        <w:br w:type="page"/>
       </w:r>
     </w:p>
     <w:p>
@@ -2271,11 +2294,6 @@
         <w:t>Родитель правды в пустоте.</w:t>
       </w:r>
     </w:p>
-    <w:p>
-      <w:r>
-        <w:br w:type="page"/>
-      </w:r>
-    </w:p>
     <w:tbl>
       <w:tblPr>
         <w:tblW w:type="auto" w:w="0"/>
@@ -2514,11 +2532,6 @@
         <w:t>Другой вариант:</w:t>
         <w:br/>
         <w:t>«Да будет утро, да будет заря! Пусть взойдет свет, пусть взойдет рассвет в небесах и на земле. Пусть не будет славы и величия в пустоте. Ты, Сердце Неба, да будет так!»</w:t>
-      </w:r>
-    </w:p>
-    <w:p>
-      <w:r>
-        <w:br w:type="page"/>
       </w:r>
     </w:p>
     <w:tbl>
@@ -2787,11 +2800,6 @@
         <w:t>t.me/andytherapist</w:t>
       </w:r>
     </w:p>
-    <w:p>
-      <w:r>
-        <w:br w:type="page"/>
-      </w:r>
-    </w:p>
     <w:tbl>
       <w:tblPr>
         <w:tblW w:type="auto" w:w="0"/>
@@ -3040,11 +3048,6 @@
         <w:t>Этот поток дает состояние безусловного принятия и безусловной поддержки.</w:t>
       </w:r>
     </w:p>
-    <w:p>
-      <w:r>
-        <w:br w:type="page"/>
-      </w:r>
-    </w:p>
     <w:tbl>
       <w:tblPr>
         <w:tblW w:type="auto" w:w="0"/>
@@ -3238,11 +3241,6 @@
         <w:t>В твоих глазах горит свет.</w:t>
         <w:br/>
         <w:t>В твоей силе раскрыть этот Свет в Новое Солнце.</w:t>
-      </w:r>
-    </w:p>
-    <w:p>
-      <w:r>
-        <w:br w:type="page"/>
       </w:r>
     </w:p>
     <w:tbl>
@@ -3429,11 +3427,6 @@
         <w:t>- давай, раскрой свое сиянье. Ты можешь светить в мир.</w:t>
       </w:r>
     </w:p>
-    <w:p>
-      <w:r>
-        <w:br w:type="page"/>
-      </w:r>
-    </w:p>
     <w:tbl>
       <w:tblPr>
         <w:tblW w:type="auto" w:w="0"/>
@@ -3624,11 +3617,6 @@
         <w:t>Попробуйте взять поток ягуара через образ. И опишите.</w:t>
         <w:br/>
         <w:t>Подробней будем разбирать на курсе</w:t>
-      </w:r>
-    </w:p>
-    <w:p>
-      <w:r>
-        <w:br w:type="page"/>
       </w:r>
     </w:p>
     <w:tbl>
@@ -3821,11 +3809,6 @@
         <w:t>Кто у нас обучается на создателей Артефактов. Повторите?</w:t>
       </w:r>
     </w:p>
-    <w:p>
-      <w:r>
-        <w:br w:type="page"/>
-      </w:r>
-    </w:p>
     <w:tbl>
       <w:tblPr>
         <w:tblW w:type="auto" w:w="0"/>
@@ -4018,11 +4001,6 @@
         <w:t>Он есть мудрость Вечности.</w:t>
         <w:br/>
         <w:t>Все в этом мире выстраивается в согласии с сиянием эманаций Кетцалькоатля.</w:t>
-      </w:r>
-    </w:p>
-    <w:p>
-      <w:r>
-        <w:br w:type="page"/>
       </w:r>
     </w:p>
     <w:tbl>
@@ -4280,11 +4258,6 @@
         <w:t>"Его дыхание движет по небу солнце и подметает дороги бога влаги Тлалока"</w:t>
       </w:r>
     </w:p>
-    <w:p>
-      <w:r>
-        <w:br w:type="page"/>
-      </w:r>
-    </w:p>
     <w:tbl>
       <w:tblPr>
         <w:tblW w:type="auto" w:w="0"/>
@@ -4518,11 +4491,6 @@
         <w:t>- диагностики ветров мира</w:t>
         <w:br/>
         <w:t>- управления ветрами.</w:t>
-      </w:r>
-    </w:p>
-    <w:p>
-      <w:r>
-        <w:br w:type="page"/>
       </w:r>
     </w:p>
     <w:tbl>
@@ -4771,11 +4739,6 @@
         <w:t>Включаться в Канал жизни майя можно самому через Рейки Иггдрасиль или через инициацию.</w:t>
       </w:r>
     </w:p>
-    <w:p>
-      <w:r>
-        <w:br w:type="page"/>
-      </w:r>
-    </w:p>
     <w:tbl>
       <w:tblPr>
         <w:tblW w:type="auto" w:w="0"/>
@@ -4996,11 +4959,6 @@
         <w:t>Верни нам надежду,</w:t>
         <w:br/>
         <w:t>Раскрой неба страсть.</w:t>
-      </w:r>
-    </w:p>
-    <w:p>
-      <w:r>
-        <w:br w:type="page"/>
       </w:r>
     </w:p>
     <w:tbl>
@@ -5195,11 +5153,6 @@
         <w:t>/ Тлалок - один из ключевых Богов, который отвечал за влагу, дожди, богатство и за молнии, разрушения, победы.</w:t>
         <w:br/>
         <w:t>Этот Канал помогает активизировать все силы пространства, чтобы преодалеть препятствия и достигнуть цели.</w:t>
-      </w:r>
-    </w:p>
-    <w:p>
-      <w:r>
-        <w:br w:type="page"/>
       </w:r>
     </w:p>
     <w:tbl>
@@ -5432,6 +5385,550 @@
         <w:t>Паблик Круг Пернатого Змея:</w:t>
         <w:br/>
         <w:t>https://t.me/mayaismagic</w:t>
+      </w:r>
+    </w:p>
+    <w:p>
+      <w:bookmarkStart w:id="24" w:name="chapter_3"/>
+      <w:pPr>
+        <w:spacing w:before="240" w:after="200" w:line="300" w:lineRule="auto"/>
+      </w:pPr>
+      <w:r>
+        <w:rPr>
+          <w:rFonts w:ascii="Georgia" w:hAnsi="Georgia"/>
+          <w:b w:val="0"/>
+          <w:color w:val="6D5A4D"/>
+          <w:sz w:val="26"/>
+        </w:rPr>
+        <w:t>От образов богов читатель переходит к настройкам, каналам, помощникам и практическим формам работы с энергиями. Это авторские практические описания, а не историческая реконструкция.</w:t>
+      </w:r>
+      <w:bookmarkEnd w:id="24"/>
+    </w:p>
+    <w:tbl>
+      <w:tblPr>
+        <w:tblW w:type="auto" w:w="0"/>
+        <w:tblLayout w:type="fixed"/>
+        <w:tblLook w:firstColumn="1" w:firstRow="1" w:lastColumn="0" w:lastRow="0" w:noHBand="0" w:noVBand="1" w:val="04A0"/>
+      </w:tblPr>
+      <w:tblGrid>
+        <w:gridCol w:w="10166"/>
+      </w:tblGrid>
+      <w:tr>
+        <w:tc>
+          <w:tcPr>
+            <w:tcW w:type="dxa" w:w="10166"/>
+            <w:shd w:fill="FBF4E9"/>
+            <w:tcMar>
+              <w:top w:w="100" w:type="dxa"/>
+              <w:start w:w="120" w:type="dxa"/>
+              <w:bottom w:w="100" w:type="dxa"/>
+              <w:end w:w="120" w:type="dxa"/>
+            </w:tcMar>
+            <w:vAlign w:val="center"/>
+          </w:tcPr>
+          <w:p>
+            <w:pPr>
+              <w:spacing w:before="0" w:after="0" w:line="324" w:lineRule="auto"/>
+            </w:pPr>
+            <w:r>
+              <w:rPr>
+                <w:rFonts w:ascii="Georgia" w:hAnsi="Georgia"/>
+                <w:b/>
+                <w:color w:val="B7791F"/>
+                <w:sz w:val="20"/>
+              </w:rPr>
+              <w:t>III. НАСТРОЙКИ И ЭНЕРГИИ МАЙЯ И АЦТЕКОВ</w:t>
+            </w:r>
+          </w:p>
+        </w:tc>
+      </w:tr>
+    </w:tbl>
+    <w:tbl>
+      <w:tblPr>
+        <w:tblW w:type="auto" w:w="0"/>
+        <w:jc w:val="right"/>
+        <w:tblLayout w:type="fixed"/>
+        <w:tblLook w:firstColumn="1" w:firstRow="1" w:lastColumn="0" w:lastRow="0" w:noHBand="0" w:noVBand="1" w:val="04A0"/>
+      </w:tblPr>
+      <w:tblGrid>
+        <w:gridCol w:w="3456"/>
+        <w:gridCol w:w="5328"/>
+      </w:tblGrid>
+      <w:tr>
+        <w:tc>
+          <w:tcPr>
+            <w:tcW w:type="dxa" w:w="5083"/>
+            <w:tcMar>
+              <w:top w:w="100" w:type="dxa"/>
+              <w:start w:w="120" w:type="dxa"/>
+              <w:bottom w:w="100" w:type="dxa"/>
+              <w:end w:w="120" w:type="dxa"/>
+            </w:tcMar>
+          </w:tcPr>
+          <w:p>
+            <w:bookmarkStart w:id="25" w:name="article_templetherapy_2262"/>
+            <w:pPr>
+              <w:spacing w:before="0" w:after="160" w:line="324" w:lineRule="auto"/>
+            </w:pPr>
+            <w:r>
+              <w:rPr>
+                <w:rFonts w:ascii="Georgia" w:hAnsi="Georgia"/>
+                <w:b/>
+                <w:color w:val="6B2F1A"/>
+                <w:sz w:val="40"/>
+              </w:rPr>
+              <w:t>#3. ТРАДИЦИЯ МАЙЯ.</w:t>
+            </w:r>
+            <w:bookmarkEnd w:id="25"/>
+          </w:p>
+          <w:p>
+            <w:pPr>
+              <w:spacing w:before="0" w:after="0" w:line="324" w:lineRule="auto"/>
+            </w:pPr>
+            <w:r>
+              <w:rPr>
+                <w:rFonts w:ascii="Georgia" w:hAnsi="Georgia"/>
+                <w:b/>
+                <w:color w:val="B7791F"/>
+                <w:sz w:val="21"/>
+              </w:rPr>
+              <w:t>Источник: TempleTherapy · пост 2262</w:t>
+              <w:br/>
+            </w:r>
+            <w:r>
+              <w:rPr>
+                <w:rFonts w:ascii="Georgia" w:hAnsi="Georgia"/>
+                <w:b w:val="0"/>
+                <w:color w:val="6D5A4D"/>
+                <w:sz w:val="21"/>
+              </w:rPr>
+              <w:t>Дата: 2025-02-11T18:10:41+00:00</w:t>
+              <w:br/>
+            </w:r>
+            <w:r>
+              <w:rPr>
+                <w:rFonts w:ascii="Georgia" w:hAnsi="Georgia"/>
+                <w:b w:val="0"/>
+                <w:color w:val="6B2F1A"/>
+                <w:sz w:val="21"/>
+              </w:rPr>
+              <w:t>https://t.me/TempleTherapy/2262</w:t>
+              <w:br/>
+            </w:r>
+            <w:r>
+              <w:rPr>
+                <w:rFonts w:ascii="Georgia" w:hAnsi="Georgia"/>
+                <w:b/>
+                <w:color w:val="B7791F"/>
+                <w:sz w:val="21"/>
+              </w:rPr>
+              <w:t>Источник: Mayaismagic · пост 159</w:t>
+              <w:br/>
+            </w:r>
+            <w:r>
+              <w:rPr>
+                <w:rFonts w:ascii="Georgia" w:hAnsi="Georgia"/>
+                <w:b w:val="0"/>
+                <w:color w:val="6D5A4D"/>
+                <w:sz w:val="21"/>
+              </w:rPr>
+              <w:t>Дата: 11.02.2025 20:57:43 UTC-05:00</w:t>
+              <w:br/>
+            </w:r>
+            <w:r>
+              <w:rPr>
+                <w:rFonts w:ascii="Georgia" w:hAnsi="Georgia"/>
+                <w:b w:val="0"/>
+                <w:color w:val="6B2F1A"/>
+                <w:sz w:val="21"/>
+              </w:rPr>
+              <w:t>https://t.me/mayaismagic/159</w:t>
+              <w:br/>
+            </w:r>
+          </w:p>
+        </w:tc>
+        <w:tc>
+          <w:tcPr>
+            <w:tcW w:type="dxa" w:w="5083"/>
+            <w:tcMar>
+              <w:top w:w="100" w:type="dxa"/>
+              <w:start w:w="120" w:type="dxa"/>
+              <w:bottom w:w="100" w:type="dxa"/>
+              <w:end w:w="120" w:type="dxa"/>
+            </w:tcMar>
+            <w:vAlign w:val="top"/>
+          </w:tcPr>
+          <w:p>
+            <w:pPr>
+              <w:jc w:val="right"/>
+            </w:pPr>
+            <w:r>
+              <w:drawing>
+                <wp:inline xmlns:a="http://schemas.openxmlformats.org/drawingml/2006/main" xmlns:pic="http://schemas.openxmlformats.org/drawingml/2006/picture">
+                  <wp:extent cx="3200400" cy="3200400"/>
+                  <wp:docPr id="23" name="Picture 23"/>
+                  <wp:cNvGraphicFramePr>
+                    <a:graphicFrameLocks noChangeAspect="1"/>
+                  </wp:cNvGraphicFramePr>
+                  <a:graphic>
+                    <a:graphicData uri="http://schemas.openxmlformats.org/drawingml/2006/picture">
+                      <pic:pic>
+                        <pic:nvPicPr>
+                          <pic:cNvPr id="0" name="post-2262-1.jpg"/>
+                          <pic:cNvPicPr/>
+                        </pic:nvPicPr>
+                        <pic:blipFill>
+                          <a:blip r:embed="rId31"/>
+                          <a:stretch>
+                            <a:fillRect/>
+                          </a:stretch>
+                        </pic:blipFill>
+                        <pic:spPr>
+                          <a:xfrm>
+                            <a:off x="0" y="0"/>
+                            <a:ext cx="3200400" cy="3200400"/>
+                          </a:xfrm>
+                          <a:prstGeom prst="rect"/>
+                        </pic:spPr>
+                      </pic:pic>
+                    </a:graphicData>
+                  </a:graphic>
+                </wp:inline>
+              </w:drawing>
+            </w:r>
+          </w:p>
+        </w:tc>
+      </w:tr>
+    </w:tbl>
+    <w:p>
+      <w:pPr>
+        <w:spacing w:before="240" w:after="140" w:line="300" w:lineRule="auto"/>
+      </w:pPr>
+      <w:r>
+        <w:rPr>
+          <w:rFonts w:ascii="Georgia" w:hAnsi="Georgia"/>
+          <w:b w:val="0"/>
+          <w:color w:val="2F241D"/>
+          <w:sz w:val="30"/>
+        </w:rPr>
+        <w:t>#3. ТРАДИЦИЯ МАЙЯ.</w:t>
+        <w:br/>
+        <w:br/>
+        <w:t>1 ступень глубоко открывает и усиливает контакт с миром. Убирает фальш и розовые очки контактов. Убирает блоки и комплексы.</w:t>
+        <w:br/>
+        <w:t>Позволяет легко создавать связи, заводить близкие, искренние отношения.</w:t>
+        <w:br/>
+        <w:br/>
+        <w:t>Мы работаем с энергиями</w:t>
+        <w:br/>
+        <w:t>СТРУКТУРА ЧЕЛОВЕКА В ТРАДИЦИИ МАЙЯ</w:t>
+        <w:br/>
+        <w:br/>
+        <w:t>1. К'УХ - универсальный божественный дух</w:t>
+        <w:br/>
+        <w:t>2. К'ИИН - свет сознания, солнечная энергия</w:t>
+        <w:br/>
+        <w:t>3. Иш/ IX - интуиция, лунная энергия.</w:t>
+        <w:br/>
+        <w:t>4. CH'ULEL - кровь, энергия жизни, жизнедеятельности.</w:t>
+        <w:br/>
+        <w:br/>
+        <w:t>ЦЕНТРЫ</w:t>
+        <w:br/>
+        <w:t>1. Центр духа (К’ухул — K’uhul) - макушка, голова</w:t>
+        <w:br/>
+        <w:t>2. Сердечный центр (Оц — Otz). Баланс и любовь.</w:t>
+        <w:br/>
+        <w:t>3. Центр жизненной силы (К’ахаб’ — Ka’hab’), действий, воли.</w:t>
+        <w:br/>
+        <w:t>Область пупка и солнечного сплетения.</w:t>
+        <w:br/>
+        <w:t>4. Центр плодородия (К’аниль — Kan’il). Управления сексуальной энергией.</w:t>
+        <w:br/>
+        <w:t>5. Корневой центр (Умук'иль — Umuk’il).</w:t>
+        <w:br/>
+        <w:t>Основание тела, ноги, ступни. Связь здоровья, связи с родом.</w:t>
+        <w:br/>
+        <w:br/>
+        <w:t>ЭНЕРГИИ СТИХИЙ</w:t>
+        <w:br/>
+        <w:t>1. ИК' - энергия ветра, творчества, связей, коммуникаций</w:t>
+        <w:br/>
+        <w:t>2. K'AN (К'АН) - земля, семя, золото, энергия лидерства, гордости, изобилия, плодородия.</w:t>
+        <w:br/>
+        <w:t>3. К'ААК' - энергия огня страсти, скорости</w:t>
+        <w:br/>
+        <w:t>4. Ха (Ha) - энергия воды, питания, очищения</w:t>
+        <w:br/>
+        <w:br/>
+        <w:t>ПОМОЩНИКИ</w:t>
+        <w:br/>
+        <w:t>1. НАУАЛЬ - связь с духовными помощниками</w:t>
+        <w:br/>
+        <w:t>2. ТОНАЛЬ - проявление материальеой силы.</w:t>
+        <w:br/>
+        <w:t>3. КААХ (KAAH)</w:t>
+        <w:br/>
+        <w:t>Связь с общиной.</w:t>
+        <w:br/>
+        <w:t>4. КААХАВИЛЬ K'ahawil (Хранитель территории)</w:t>
+        <w:br/>
+        <w:br/>
+        <w:t>КАНАЛЫ:</w:t>
+        <w:br/>
+        <w:t>1. Сак Бе (Sac Be) — Священная дорога, белый путь энергии:</w:t>
+        <w:br/>
+        <w:t>Соединяет сердце (центр любви) с головой (центр духа). Связь сознания, духа и интуиции. А так же с предками.</w:t>
+        <w:br/>
+        <w:t>2. Балак’че (Balak’chaj):</w:t>
+        <w:br/>
+        <w:t>Канал, связывающий тело с землёй, родом через ноги. Управляет физическим здоровьем и устойчивостью.</w:t>
+        <w:br/>
+        <w:br/>
+        <w:t>Дополнительный перечень энергий:</w:t>
+        <w:br/>
+        <w:t>- Света Сознания (Кинич)</w:t>
+        <w:br/>
+        <w:t>- Рода</w:t>
+        <w:br/>
+        <w:t>- Предназначения</w:t>
+        <w:br/>
+        <w:t>- Духовных Помощников (Науаль)</w:t>
+      </w:r>
+    </w:p>
+    <w:tbl>
+      <w:tblPr>
+        <w:tblW w:type="auto" w:w="0"/>
+        <w:tblLayout w:type="fixed"/>
+        <w:tblLook w:firstColumn="1" w:firstRow="1" w:lastColumn="0" w:lastRow="0" w:noHBand="0" w:noVBand="1" w:val="04A0"/>
+      </w:tblPr>
+      <w:tblGrid>
+        <w:gridCol w:w="10166"/>
+      </w:tblGrid>
+      <w:tr>
+        <w:tc>
+          <w:tcPr>
+            <w:tcW w:type="dxa" w:w="10166"/>
+            <w:shd w:fill="FBF4E9"/>
+            <w:tcMar>
+              <w:top w:w="100" w:type="dxa"/>
+              <w:start w:w="120" w:type="dxa"/>
+              <w:bottom w:w="100" w:type="dxa"/>
+              <w:end w:w="120" w:type="dxa"/>
+            </w:tcMar>
+            <w:vAlign w:val="center"/>
+          </w:tcPr>
+          <w:p>
+            <w:pPr>
+              <w:spacing w:before="0" w:after="0" w:line="324" w:lineRule="auto"/>
+            </w:pPr>
+            <w:r>
+              <w:rPr>
+                <w:rFonts w:ascii="Georgia" w:hAnsi="Georgia"/>
+                <w:b/>
+                <w:color w:val="B7791F"/>
+                <w:sz w:val="20"/>
+              </w:rPr>
+              <w:t>III. НАСТРОЙКИ И ЭНЕРГИИ МАЙЯ И АЦТЕКОВ</w:t>
+            </w:r>
+          </w:p>
+        </w:tc>
+      </w:tr>
+    </w:tbl>
+    <w:tbl>
+      <w:tblPr>
+        <w:tblW w:type="auto" w:w="0"/>
+        <w:jc w:val="right"/>
+        <w:tblLayout w:type="fixed"/>
+        <w:tblLook w:firstColumn="1" w:firstRow="1" w:lastColumn="0" w:lastRow="0" w:noHBand="0" w:noVBand="1" w:val="04A0"/>
+      </w:tblPr>
+      <w:tblGrid>
+        <w:gridCol w:w="3456"/>
+        <w:gridCol w:w="5328"/>
+      </w:tblGrid>
+      <w:tr>
+        <w:tc>
+          <w:tcPr>
+            <w:tcW w:type="dxa" w:w="5083"/>
+            <w:tcMar>
+              <w:top w:w="100" w:type="dxa"/>
+              <w:start w:w="120" w:type="dxa"/>
+              <w:bottom w:w="100" w:type="dxa"/>
+              <w:end w:w="120" w:type="dxa"/>
+            </w:tcMar>
+          </w:tcPr>
+          <w:p>
+            <w:bookmarkStart w:id="26" w:name="article_mayaismagic_214"/>
+            <w:pPr>
+              <w:spacing w:before="0" w:after="160" w:line="324" w:lineRule="auto"/>
+            </w:pPr>
+            <w:r>
+              <w:rPr>
+                <w:rFonts w:ascii="Georgia" w:hAnsi="Georgia"/>
+                <w:b/>
+                <w:color w:val="6B2F1A"/>
+                <w:sz w:val="40"/>
+              </w:rPr>
+              <w:t>НАСТРОЙКА.</w:t>
+            </w:r>
+            <w:bookmarkEnd w:id="26"/>
+          </w:p>
+          <w:p>
+            <w:pPr>
+              <w:spacing w:before="0" w:after="0" w:line="324" w:lineRule="auto"/>
+            </w:pPr>
+            <w:r>
+              <w:rPr>
+                <w:rFonts w:ascii="Georgia" w:hAnsi="Georgia"/>
+                <w:b/>
+                <w:color w:val="B7791F"/>
+                <w:sz w:val="21"/>
+              </w:rPr>
+              <w:t>Источник: Mayaismagic · пост 214</w:t>
+              <w:br/>
+            </w:r>
+            <w:r>
+              <w:rPr>
+                <w:rFonts w:ascii="Georgia" w:hAnsi="Georgia"/>
+                <w:b w:val="0"/>
+                <w:color w:val="6D5A4D"/>
+                <w:sz w:val="21"/>
+              </w:rPr>
+              <w:t>Дата: 11.02.2025 21:03:16 UTC-05:00</w:t>
+              <w:br/>
+            </w:r>
+            <w:r>
+              <w:rPr>
+                <w:rFonts w:ascii="Georgia" w:hAnsi="Georgia"/>
+                <w:b w:val="0"/>
+                <w:color w:val="6B2F1A"/>
+                <w:sz w:val="21"/>
+              </w:rPr>
+              <w:t>https://t.me/mayaismagic/214</w:t>
+              <w:br/>
+            </w:r>
+            <w:r>
+              <w:rPr>
+                <w:rFonts w:ascii="Georgia" w:hAnsi="Georgia"/>
+                <w:b/>
+                <w:color w:val="B7791F"/>
+                <w:sz w:val="21"/>
+              </w:rPr>
+              <w:t>Источник: TempleTherapy · пост 2217</w:t>
+              <w:br/>
+            </w:r>
+            <w:r>
+              <w:rPr>
+                <w:rFonts w:ascii="Georgia" w:hAnsi="Georgia"/>
+                <w:b w:val="0"/>
+                <w:color w:val="6D5A4D"/>
+                <w:sz w:val="21"/>
+              </w:rPr>
+              <w:t>Дата: 2025-01-10T01:20:12+00:00</w:t>
+              <w:br/>
+            </w:r>
+            <w:r>
+              <w:rPr>
+                <w:rFonts w:ascii="Georgia" w:hAnsi="Georgia"/>
+                <w:b w:val="0"/>
+                <w:color w:val="6B2F1A"/>
+                <w:sz w:val="21"/>
+              </w:rPr>
+              <w:t>https://t.me/TempleTherapy/2217</w:t>
+              <w:br/>
+            </w:r>
+          </w:p>
+        </w:tc>
+        <w:tc>
+          <w:tcPr>
+            <w:tcW w:type="dxa" w:w="5083"/>
+            <w:tcMar>
+              <w:top w:w="100" w:type="dxa"/>
+              <w:start w:w="120" w:type="dxa"/>
+              <w:bottom w:w="100" w:type="dxa"/>
+              <w:end w:w="120" w:type="dxa"/>
+            </w:tcMar>
+            <w:vAlign w:val="top"/>
+          </w:tcPr>
+          <w:p>
+            <w:pPr>
+              <w:jc w:val="right"/>
+            </w:pPr>
+            <w:r>
+              <w:drawing>
+                <wp:inline xmlns:a="http://schemas.openxmlformats.org/drawingml/2006/main" xmlns:pic="http://schemas.openxmlformats.org/drawingml/2006/picture">
+                  <wp:extent cx="3200400" cy="3200400"/>
+                  <wp:docPr id="24" name="Picture 24"/>
+                  <wp:cNvGraphicFramePr>
+                    <a:graphicFrameLocks noChangeAspect="1"/>
+                  </wp:cNvGraphicFramePr>
+                  <a:graphic>
+                    <a:graphicData uri="http://schemas.openxmlformats.org/drawingml/2006/picture">
+                      <pic:pic>
+                        <pic:nvPicPr>
+                          <pic:cNvPr id="0" name="photo_170@11-02-2025_21-03-16.jpg"/>
+                          <pic:cNvPicPr/>
+                        </pic:nvPicPr>
+                        <pic:blipFill>
+                          <a:blip r:embed="rId32"/>
+                          <a:stretch>
+                            <a:fillRect/>
+                          </a:stretch>
+                        </pic:blipFill>
+                        <pic:spPr>
+                          <a:xfrm>
+                            <a:off x="0" y="0"/>
+                            <a:ext cx="3200400" cy="3200400"/>
+                          </a:xfrm>
+                          <a:prstGeom prst="rect"/>
+                        </pic:spPr>
+                      </pic:pic>
+                    </a:graphicData>
+                  </a:graphic>
+                </wp:inline>
+              </w:drawing>
+            </w:r>
+          </w:p>
+        </w:tc>
+      </w:tr>
+    </w:tbl>
+    <w:p>
+      <w:pPr>
+        <w:spacing w:before="240" w:after="140" w:line="300" w:lineRule="auto"/>
+      </w:pPr>
+      <w:r>
+        <w:rPr>
+          <w:rFonts w:ascii="Georgia" w:hAnsi="Georgia"/>
+          <w:b w:val="0"/>
+          <w:color w:val="2F241D"/>
+          <w:sz w:val="30"/>
+        </w:rPr>
+        <w:t>НАСТРОЙКА.</w:t>
+        <w:br/>
+        <w:t>КАНАЛ СОЛНЦА АЦТЕКОВ (ТОНАТИУ)</w:t>
+        <w:br/>
+        <w:t>Здесь доблесть вскрывает бурлящие вены.</w:t>
+        <w:br/>
+        <w:t>Свет Солнца сияет из смелых очей.</w:t>
+        <w:br/>
+        <w:t>Решительно, жесто преследуя цели</w:t>
+        <w:br/>
+        <w:t>Огнем разгорится безстрашность мечей.</w:t>
+        <w:br/>
+        <w:t>ПОЯСНЕНИЕ.</w:t>
+        <w:br/>
+        <w:t>Настройка разогревает Боевой Дух.</w:t>
+        <w:br/>
+        <w:t>Канал Тонатиу можно использовать перед важными делами, переговорами, выступлениями, продажами, презентациями.</w:t>
+        <w:br/>
+        <w:t>ПРИМЕЧАНИЕ</w:t>
+        <w:br/>
+        <w:t>А Ацтеков считалось, что в голове находится центр тоналли — внутренней энергии, связанной с солнцем и жизненной силой. Эта энергия управляла сознанием, волей и внутренней мощью.</w:t>
+        <w:br/>
+        <w:t>Солнечная энергия даёт человеку силу действовать (голова) и поддерживает его жизнь через кровь.</w:t>
+        <w:br/>
+        <w:t>ЦИТАТА</w:t>
+        <w:br/>
+        <w:t>"И когда солнце появилось, оно начало светить, распространяя свой свет по всему миру. Но оно не двигалось; оно стояло на месте, не двигаясь по небу. Тогда Боги решили принести себя в жертву."</w:t>
       </w:r>
     </w:p>
     <w:sectPr>

</xml_diff>